<commit_message>
created new branch based on 4
4 script approach. now needs two terminals, one for detection, one for visualizing.
</commit_message>
<xml_diff>
--- a/Text/log.docx
+++ b/Text/log.docx
@@ -2406,6 +2406,32 @@
           <w:szCs w:val="20"/>
         </w:rPr>
         <w:t>changed json to raw binary and something about zeromq publisher in python</w:t>
+      </w:r>
+    </w:p>
+    <w:p>
+      <w:pPr>
+        <w:rPr>
+          <w:rFonts w:ascii="Times New Roman" w:hAnsi="Times New Roman" w:cs="Times New Roman"/>
+          <w:sz w:val="20"/>
+          <w:szCs w:val="20"/>
+        </w:rPr>
+      </w:pPr>
+    </w:p>
+    <w:p>
+      <w:pPr>
+        <w:rPr>
+          <w:rFonts w:ascii="Times New Roman" w:hAnsi="Times New Roman" w:cs="Times New Roman"/>
+          <w:sz w:val="20"/>
+          <w:szCs w:val="20"/>
+        </w:rPr>
+      </w:pPr>
+      <w:r>
+        <w:rPr>
+          <w:rFonts w:ascii="Times New Roman" w:hAnsi="Times New Roman" w:cs="Times New Roman"/>
+          <w:sz w:val="20"/>
+          <w:szCs w:val="20"/>
+        </w:rPr>
+        <w:t>BIG SPLIT, INTO 4 scripts</w:t>
       </w:r>
     </w:p>
     <w:p>
@@ -3177,6 +3203,7 @@
   <w:style w:type="character" w:default="1" w:styleId="DefaultParagraphFont">
     <w:name w:val="Default Paragraph Font"/>
     <w:uiPriority w:val="1"/>
+    <w:semiHidden/>
     <w:unhideWhenUsed/>
   </w:style>
   <w:style w:type="table" w:default="1" w:styleId="TableNormal">

</xml_diff>

<commit_message>
now works better, check log
</commit_message>
<xml_diff>
--- a/Text/log.docx
+++ b/Text/log.docx
@@ -2421,27 +2421,909 @@
       <w:pPr>
         <w:rPr>
           <w:rFonts w:ascii="Times New Roman" w:hAnsi="Times New Roman" w:cs="Times New Roman"/>
-          <w:sz w:val="20"/>
-          <w:szCs w:val="20"/>
-        </w:rPr>
-      </w:pPr>
-      <w:r>
-        <w:rPr>
-          <w:rFonts w:ascii="Times New Roman" w:hAnsi="Times New Roman" w:cs="Times New Roman"/>
+          <w:b/>
+          <w:bCs/>
+          <w:sz w:val="20"/>
+          <w:szCs w:val="20"/>
+        </w:rPr>
+      </w:pPr>
+      <w:r>
+        <w:rPr>
+          <w:rFonts w:ascii="Times New Roman" w:hAnsi="Times New Roman" w:cs="Times New Roman"/>
+          <w:b/>
+          <w:bCs/>
           <w:sz w:val="20"/>
           <w:szCs w:val="20"/>
         </w:rPr>
         <w:t>BIG SPLIT, INTO 4 scripts</w:t>
       </w:r>
-    </w:p>
-    <w:p>
-      <w:pPr>
-        <w:rPr>
-          <w:rFonts w:ascii="Times New Roman" w:hAnsi="Times New Roman" w:cs="Times New Roman"/>
-          <w:sz w:val="20"/>
-          <w:szCs w:val="20"/>
-        </w:rPr>
-      </w:pPr>
+      <w:r>
+        <w:rPr>
+          <w:rFonts w:ascii="Times New Roman" w:hAnsi="Times New Roman" w:cs="Times New Roman"/>
+          <w:b/>
+          <w:bCs/>
+          <w:sz w:val="20"/>
+          <w:szCs w:val="20"/>
+        </w:rPr>
+        <w:t>. now requires 2 terminals</w:t>
+      </w:r>
+    </w:p>
+    <w:p>
+      <w:pPr>
+        <w:rPr>
+          <w:rFonts w:ascii="Times New Roman" w:hAnsi="Times New Roman" w:cs="Times New Roman"/>
+          <w:sz w:val="20"/>
+          <w:szCs w:val="20"/>
+        </w:rPr>
+      </w:pPr>
+      <w:r>
+        <w:rPr>
+          <w:rFonts w:ascii="Times New Roman" w:hAnsi="Times New Roman" w:cs="Times New Roman"/>
+          <w:sz w:val="20"/>
+          <w:szCs w:val="20"/>
+        </w:rPr>
+        <w:t>notes:</w:t>
+      </w:r>
+    </w:p>
+    <w:p>
+      <w:pPr>
+        <w:rPr>
+          <w:rFonts w:ascii="Times New Roman" w:hAnsi="Times New Roman" w:cs="Times New Roman"/>
+          <w:sz w:val="20"/>
+          <w:szCs w:val="20"/>
+        </w:rPr>
+      </w:pPr>
+      <w:r>
+        <w:rPr>
+          <w:rFonts w:ascii="Times New Roman" w:hAnsi="Times New Roman" w:cs="Times New Roman"/>
+          <w:sz w:val="20"/>
+          <w:szCs w:val="20"/>
+        </w:rPr>
+        <w:t>the points are well represented now.</w:t>
+      </w:r>
+    </w:p>
+    <w:p>
+      <w:pPr>
+        <w:pBdr>
+          <w:bottom w:val="single" w:sz="6" w:space="1" w:color="auto"/>
+        </w:pBdr>
+        <w:rPr>
+          <w:rFonts w:ascii="Times New Roman" w:hAnsi="Times New Roman" w:cs="Times New Roman"/>
+          <w:sz w:val="20"/>
+          <w:szCs w:val="20"/>
+        </w:rPr>
+      </w:pPr>
+      <w:r>
+        <w:rPr>
+          <w:rFonts w:ascii="Times New Roman" w:hAnsi="Times New Roman" w:cs="Times New Roman"/>
+          <w:sz w:val="20"/>
+          <w:szCs w:val="20"/>
+        </w:rPr>
+        <w:t>the movement is perfect, it should only ever be changed if specified so</w:t>
+      </w:r>
+    </w:p>
+    <w:p>
+      <w:pPr>
+        <w:rPr>
+          <w:rFonts w:ascii="Times New Roman" w:hAnsi="Times New Roman" w:cs="Times New Roman"/>
+          <w:sz w:val="20"/>
+          <w:szCs w:val="20"/>
+        </w:rPr>
+      </w:pPr>
+    </w:p>
+    <w:p>
+      <w:pPr>
+        <w:rPr>
+          <w:rFonts w:ascii="Times New Roman" w:hAnsi="Times New Roman" w:cs="Times New Roman"/>
+          <w:sz w:val="20"/>
+          <w:szCs w:val="20"/>
+        </w:rPr>
+      </w:pPr>
+      <w:r>
+        <w:rPr>
+          <w:rFonts w:ascii="Times New Roman" w:hAnsi="Times New Roman" w:cs="Times New Roman"/>
+          <w:sz w:val="20"/>
+          <w:szCs w:val="20"/>
+        </w:rPr>
+        <w:t>notes:</w:t>
+      </w:r>
+    </w:p>
+    <w:p>
+      <w:pPr>
+        <w:rPr>
+          <w:rFonts w:ascii="Times New Roman" w:hAnsi="Times New Roman" w:cs="Times New Roman"/>
+          <w:sz w:val="20"/>
+          <w:szCs w:val="20"/>
+        </w:rPr>
+      </w:pPr>
+      <w:r>
+        <w:rPr>
+          <w:rFonts w:ascii="Times New Roman" w:hAnsi="Times New Roman" w:cs="Times New Roman"/>
+          <w:sz w:val="20"/>
+          <w:szCs w:val="20"/>
+        </w:rPr>
+        <w:t>the points are well represented now.</w:t>
+      </w:r>
+    </w:p>
+    <w:p>
+      <w:pPr>
+        <w:rPr>
+          <w:rFonts w:ascii="Times New Roman" w:hAnsi="Times New Roman" w:cs="Times New Roman"/>
+          <w:sz w:val="20"/>
+          <w:szCs w:val="20"/>
+        </w:rPr>
+      </w:pPr>
+      <w:r>
+        <w:rPr>
+          <w:rFonts w:ascii="Times New Roman" w:hAnsi="Times New Roman" w:cs="Times New Roman"/>
+          <w:sz w:val="20"/>
+          <w:szCs w:val="20"/>
+        </w:rPr>
+        <w:t>the movement is perfect, it should only ever be changed if specified so</w:t>
+      </w:r>
+    </w:p>
+    <w:p>
+      <w:pPr>
+        <w:rPr>
+          <w:rFonts w:ascii="Times New Roman" w:hAnsi="Times New Roman" w:cs="Times New Roman"/>
+          <w:sz w:val="20"/>
+          <w:szCs w:val="20"/>
+        </w:rPr>
+      </w:pPr>
+      <w:r>
+        <w:rPr>
+          <w:rFonts w:ascii="Times New Roman" w:hAnsi="Times New Roman" w:cs="Times New Roman"/>
+          <w:sz w:val="20"/>
+          <w:szCs w:val="20"/>
+        </w:rPr>
+        <w:t>there now seem to be 2 types of representations in the visualizer. good</w:t>
+      </w:r>
+    </w:p>
+    <w:p>
+      <w:pPr>
+        <w:rPr>
+          <w:rFonts w:ascii="Times New Roman" w:hAnsi="Times New Roman" w:cs="Times New Roman"/>
+          <w:sz w:val="20"/>
+          <w:szCs w:val="20"/>
+        </w:rPr>
+      </w:pPr>
+      <w:r>
+        <w:rPr>
+          <w:rFonts w:ascii="Times New Roman" w:hAnsi="Times New Roman" w:cs="Times New Roman"/>
+          <w:sz w:val="20"/>
+          <w:szCs w:val="20"/>
+        </w:rPr>
+        <w:t>thank you</w:t>
+      </w:r>
+    </w:p>
+    <w:p>
+      <w:pPr>
+        <w:rPr>
+          <w:rFonts w:ascii="Times New Roman" w:hAnsi="Times New Roman" w:cs="Times New Roman"/>
+          <w:sz w:val="20"/>
+          <w:szCs w:val="20"/>
+        </w:rPr>
+      </w:pPr>
+    </w:p>
+    <w:p>
+      <w:pPr>
+        <w:rPr>
+          <w:rFonts w:ascii="Times New Roman" w:hAnsi="Times New Roman" w:cs="Times New Roman"/>
+          <w:sz w:val="20"/>
+          <w:szCs w:val="20"/>
+        </w:rPr>
+      </w:pPr>
+    </w:p>
+    <w:p>
+      <w:pPr>
+        <w:rPr>
+          <w:rFonts w:ascii="Times New Roman" w:hAnsi="Times New Roman" w:cs="Times New Roman"/>
+          <w:sz w:val="20"/>
+          <w:szCs w:val="20"/>
+        </w:rPr>
+      </w:pPr>
+    </w:p>
+    <w:p>
+      <w:pPr>
+        <w:rPr>
+          <w:rFonts w:ascii="Times New Roman" w:hAnsi="Times New Roman" w:cs="Times New Roman"/>
+          <w:sz w:val="20"/>
+          <w:szCs w:val="20"/>
+        </w:rPr>
+      </w:pPr>
+    </w:p>
+    <w:p>
+      <w:pPr>
+        <w:rPr>
+          <w:rFonts w:ascii="Times New Roman" w:hAnsi="Times New Roman" w:cs="Times New Roman"/>
+          <w:b/>
+          <w:bCs/>
+          <w:sz w:val="20"/>
+          <w:szCs w:val="20"/>
+        </w:rPr>
+      </w:pPr>
+      <w:r>
+        <w:rPr>
+          <w:rFonts w:ascii="Times New Roman" w:hAnsi="Times New Roman" w:cs="Times New Roman"/>
+          <w:b/>
+          <w:bCs/>
+          <w:sz w:val="20"/>
+          <w:szCs w:val="20"/>
+        </w:rPr>
+        <w:lastRenderedPageBreak/>
+        <w:t>to change:</w:t>
+      </w:r>
+    </w:p>
+    <w:p>
+      <w:pPr>
+        <w:rPr>
+          <w:rFonts w:ascii="Times New Roman" w:hAnsi="Times New Roman" w:cs="Times New Roman"/>
+          <w:sz w:val="20"/>
+          <w:szCs w:val="20"/>
+        </w:rPr>
+      </w:pPr>
+      <w:r>
+        <w:rPr>
+          <w:rFonts w:ascii="Times New Roman" w:hAnsi="Times New Roman" w:cs="Times New Roman"/>
+          <w:sz w:val="20"/>
+          <w:szCs w:val="20"/>
+        </w:rPr>
+        <w:t xml:space="preserve">1. the cylinders representing the tree trunks are aligned wrong. </w:t>
+      </w:r>
+    </w:p>
+    <w:p>
+      <w:pPr>
+        <w:rPr>
+          <w:rFonts w:ascii="Times New Roman" w:hAnsi="Times New Roman" w:cs="Times New Roman"/>
+          <w:sz w:val="20"/>
+          <w:szCs w:val="20"/>
+        </w:rPr>
+      </w:pPr>
+      <w:r>
+        <w:rPr>
+          <w:rFonts w:ascii="Times New Roman" w:hAnsi="Times New Roman" w:cs="Times New Roman"/>
+          <w:sz w:val="20"/>
+          <w:szCs w:val="20"/>
+        </w:rPr>
+        <w:t>a. have them always vertical</w:t>
+      </w:r>
+    </w:p>
+    <w:p>
+      <w:pPr>
+        <w:rPr>
+          <w:rFonts w:ascii="Times New Roman" w:hAnsi="Times New Roman" w:cs="Times New Roman"/>
+          <w:sz w:val="20"/>
+          <w:szCs w:val="20"/>
+        </w:rPr>
+      </w:pPr>
+      <w:r>
+        <w:rPr>
+          <w:rFonts w:ascii="Times New Roman" w:hAnsi="Times New Roman" w:cs="Times New Roman"/>
+          <w:sz w:val="20"/>
+          <w:szCs w:val="20"/>
+        </w:rPr>
+        <w:t>b. represent the tree trunks in multiple interconnected cylinders if possible, with varying face widths</w:t>
+      </w:r>
+    </w:p>
+    <w:p>
+      <w:pPr>
+        <w:rPr>
+          <w:rFonts w:ascii="Times New Roman" w:hAnsi="Times New Roman" w:cs="Times New Roman"/>
+          <w:sz w:val="20"/>
+          <w:szCs w:val="20"/>
+        </w:rPr>
+      </w:pPr>
+      <w:r>
+        <w:rPr>
+          <w:rFonts w:ascii="Times New Roman" w:hAnsi="Times New Roman" w:cs="Times New Roman"/>
+          <w:sz w:val="20"/>
+          <w:szCs w:val="20"/>
+        </w:rPr>
+        <w:t>c. make them the color #361514</w:t>
+      </w:r>
+    </w:p>
+    <w:p>
+      <w:pPr>
+        <w:rPr>
+          <w:rFonts w:ascii="Times New Roman" w:hAnsi="Times New Roman" w:cs="Times New Roman"/>
+          <w:sz w:val="20"/>
+          <w:szCs w:val="20"/>
+        </w:rPr>
+      </w:pPr>
+      <w:r>
+        <w:rPr>
+          <w:rFonts w:ascii="Times New Roman" w:hAnsi="Times New Roman" w:cs="Times New Roman"/>
+          <w:sz w:val="20"/>
+          <w:szCs w:val="20"/>
+        </w:rPr>
+        <w:t>2. add the representation of tree canopy</w:t>
+      </w:r>
+    </w:p>
+    <w:p>
+      <w:pPr>
+        <w:rPr>
+          <w:rFonts w:ascii="Times New Roman" w:hAnsi="Times New Roman" w:cs="Times New Roman"/>
+          <w:sz w:val="20"/>
+          <w:szCs w:val="20"/>
+        </w:rPr>
+      </w:pPr>
+      <w:r>
+        <w:rPr>
+          <w:rFonts w:ascii="Times New Roman" w:hAnsi="Times New Roman" w:cs="Times New Roman"/>
+          <w:sz w:val="20"/>
+          <w:szCs w:val="20"/>
+        </w:rPr>
+        <w:t xml:space="preserve">a. reconstruct geometry using the points that are detected as canopy </w:t>
+      </w:r>
+    </w:p>
+    <w:p>
+      <w:pPr>
+        <w:rPr>
+          <w:rFonts w:ascii="Times New Roman" w:hAnsi="Times New Roman" w:cs="Times New Roman"/>
+          <w:sz w:val="20"/>
+          <w:szCs w:val="20"/>
+        </w:rPr>
+      </w:pPr>
+      <w:r>
+        <w:rPr>
+          <w:rFonts w:ascii="Times New Roman" w:hAnsi="Times New Roman" w:cs="Times New Roman"/>
+          <w:sz w:val="20"/>
+          <w:szCs w:val="20"/>
+        </w:rPr>
+        <w:t>b. make it color #2f4d40</w:t>
+      </w:r>
+    </w:p>
+    <w:p>
+      <w:pPr>
+        <w:rPr>
+          <w:rFonts w:ascii="Times New Roman" w:hAnsi="Times New Roman" w:cs="Times New Roman"/>
+          <w:sz w:val="20"/>
+          <w:szCs w:val="20"/>
+        </w:rPr>
+      </w:pPr>
+      <w:r>
+        <w:rPr>
+          <w:rFonts w:ascii="Times New Roman" w:hAnsi="Times New Roman" w:cs="Times New Roman"/>
+          <w:sz w:val="20"/>
+          <w:szCs w:val="20"/>
+        </w:rPr>
+        <w:t>3. add the representation of potential rubble</w:t>
+      </w:r>
+    </w:p>
+    <w:p>
+      <w:pPr>
+        <w:rPr>
+          <w:rFonts w:ascii="Times New Roman" w:hAnsi="Times New Roman" w:cs="Times New Roman"/>
+          <w:sz w:val="20"/>
+          <w:szCs w:val="20"/>
+        </w:rPr>
+      </w:pPr>
+      <w:r>
+        <w:rPr>
+          <w:rFonts w:ascii="Times New Roman" w:hAnsi="Times New Roman" w:cs="Times New Roman"/>
+          <w:sz w:val="20"/>
+          <w:szCs w:val="20"/>
+        </w:rPr>
+        <w:t>a. anything that cannot be categorized as a bush, tree, or dirt (as in walkable terrain), categorize for now as rubble (including man-made structures).</w:t>
+      </w:r>
+    </w:p>
+    <w:p>
+      <w:pPr>
+        <w:rPr>
+          <w:rFonts w:ascii="Times New Roman" w:hAnsi="Times New Roman" w:cs="Times New Roman"/>
+          <w:sz w:val="20"/>
+          <w:szCs w:val="20"/>
+        </w:rPr>
+      </w:pPr>
+      <w:r>
+        <w:rPr>
+          <w:rFonts w:ascii="Times New Roman" w:hAnsi="Times New Roman" w:cs="Times New Roman"/>
+          <w:sz w:val="20"/>
+          <w:szCs w:val="20"/>
+        </w:rPr>
+        <w:t>b. make them color #444a4f</w:t>
+      </w:r>
+    </w:p>
+    <w:p>
+      <w:pPr>
+        <w:rPr>
+          <w:rFonts w:ascii="Times New Roman" w:hAnsi="Times New Roman" w:cs="Times New Roman"/>
+          <w:sz w:val="20"/>
+          <w:szCs w:val="20"/>
+        </w:rPr>
+      </w:pPr>
+      <w:r>
+        <w:rPr>
+          <w:rFonts w:ascii="Times New Roman" w:hAnsi="Times New Roman" w:cs="Times New Roman"/>
+          <w:sz w:val="20"/>
+          <w:szCs w:val="20"/>
+        </w:rPr>
+        <w:t xml:space="preserve">4. have a toggle in godot that switches the visualizer to show either </w:t>
+      </w:r>
+    </w:p>
+    <w:p>
+      <w:pPr>
+        <w:rPr>
+          <w:rFonts w:ascii="Times New Roman" w:hAnsi="Times New Roman" w:cs="Times New Roman"/>
+          <w:sz w:val="20"/>
+          <w:szCs w:val="20"/>
+        </w:rPr>
+      </w:pPr>
+      <w:r>
+        <w:rPr>
+          <w:rFonts w:ascii="Times New Roman" w:hAnsi="Times New Roman" w:cs="Times New Roman"/>
+          <w:sz w:val="20"/>
+          <w:szCs w:val="20"/>
+        </w:rPr>
+        <w:t>a. only the point cloud so far</w:t>
+      </w:r>
+    </w:p>
+    <w:p>
+      <w:pPr>
+        <w:rPr>
+          <w:rFonts w:ascii="Times New Roman" w:hAnsi="Times New Roman" w:cs="Times New Roman"/>
+          <w:sz w:val="20"/>
+          <w:szCs w:val="20"/>
+        </w:rPr>
+      </w:pPr>
+      <w:r>
+        <w:rPr>
+          <w:rFonts w:ascii="Times New Roman" w:hAnsi="Times New Roman" w:cs="Times New Roman"/>
+          <w:sz w:val="20"/>
+          <w:szCs w:val="20"/>
+        </w:rPr>
+        <w:t>b. only the reconstructed geometry in the visualizer + the ground (default)</w:t>
+      </w:r>
+    </w:p>
+    <w:p>
+      <w:pPr>
+        <w:rPr>
+          <w:rFonts w:ascii="Times New Roman" w:hAnsi="Times New Roman" w:cs="Times New Roman"/>
+          <w:sz w:val="20"/>
+          <w:szCs w:val="20"/>
+        </w:rPr>
+      </w:pPr>
+      <w:r>
+        <w:rPr>
+          <w:rFonts w:ascii="Times New Roman" w:hAnsi="Times New Roman" w:cs="Times New Roman"/>
+          <w:sz w:val="20"/>
+          <w:szCs w:val="20"/>
+        </w:rPr>
+        <w:t>c. point cloud with reconstructed visualizer geometry on top</w:t>
+      </w:r>
+    </w:p>
+    <w:p>
+      <w:pPr>
+        <w:rPr>
+          <w:rFonts w:ascii="Times New Roman" w:hAnsi="Times New Roman" w:cs="Times New Roman"/>
+          <w:sz w:val="20"/>
+          <w:szCs w:val="20"/>
+        </w:rPr>
+      </w:pPr>
+      <w:r>
+        <w:rPr>
+          <w:rFonts w:ascii="Times New Roman" w:hAnsi="Times New Roman" w:cs="Times New Roman"/>
+          <w:sz w:val="20"/>
+          <w:szCs w:val="20"/>
+        </w:rPr>
+        <w:t>5. all created geometry that is not purely the visualization of a dot should be 50% see-through</w:t>
+      </w:r>
+    </w:p>
+    <w:p>
+      <w:pPr>
+        <w:rPr>
+          <w:rFonts w:ascii="Times New Roman" w:hAnsi="Times New Roman" w:cs="Times New Roman"/>
+          <w:sz w:val="20"/>
+          <w:szCs w:val="20"/>
+        </w:rPr>
+      </w:pPr>
+      <w:r>
+        <w:rPr>
+          <w:noProof/>
+        </w:rPr>
+        <w:lastRenderedPageBreak/>
+        <w:drawing>
+          <wp:inline distT="0" distB="0" distL="0" distR="0" wp14:anchorId="6565313E" wp14:editId="21968BC8">
+            <wp:extent cx="5943600" cy="3623945"/>
+            <wp:effectExtent l="0" t="0" r="0" b="0"/>
+            <wp:docPr id="1359715636" name="Picture 1"/>
+            <wp:cNvGraphicFramePr>
+              <a:graphicFrameLocks xmlns:a="http://schemas.openxmlformats.org/drawingml/2006/main" noChangeAspect="1"/>
+            </wp:cNvGraphicFramePr>
+            <a:graphic xmlns:a="http://schemas.openxmlformats.org/drawingml/2006/main">
+              <a:graphicData uri="http://schemas.openxmlformats.org/drawingml/2006/picture">
+                <pic:pic xmlns:pic="http://schemas.openxmlformats.org/drawingml/2006/picture">
+                  <pic:nvPicPr>
+                    <pic:cNvPr id="1359715636" name=""/>
+                    <pic:cNvPicPr/>
+                  </pic:nvPicPr>
+                  <pic:blipFill>
+                    <a:blip r:embed="rId24"/>
+                    <a:stretch>
+                      <a:fillRect/>
+                    </a:stretch>
+                  </pic:blipFill>
+                  <pic:spPr>
+                    <a:xfrm>
+                      <a:off x="0" y="0"/>
+                      <a:ext cx="5943600" cy="3623945"/>
+                    </a:xfrm>
+                    <a:prstGeom prst="rect">
+                      <a:avLst/>
+                    </a:prstGeom>
+                  </pic:spPr>
+                </pic:pic>
+              </a:graphicData>
+            </a:graphic>
+          </wp:inline>
+        </w:drawing>
+      </w:r>
+      <w:r>
+        <w:rPr>
+          <w:noProof/>
+        </w:rPr>
+        <w:drawing>
+          <wp:inline distT="0" distB="0" distL="0" distR="0" wp14:anchorId="388968B5" wp14:editId="6104C046">
+            <wp:extent cx="5943600" cy="3611245"/>
+            <wp:effectExtent l="0" t="0" r="0" b="8255"/>
+            <wp:docPr id="1729563290" name="Picture 1"/>
+            <wp:cNvGraphicFramePr>
+              <a:graphicFrameLocks xmlns:a="http://schemas.openxmlformats.org/drawingml/2006/main" noChangeAspect="1"/>
+            </wp:cNvGraphicFramePr>
+            <a:graphic xmlns:a="http://schemas.openxmlformats.org/drawingml/2006/main">
+              <a:graphicData uri="http://schemas.openxmlformats.org/drawingml/2006/picture">
+                <pic:pic xmlns:pic="http://schemas.openxmlformats.org/drawingml/2006/picture">
+                  <pic:nvPicPr>
+                    <pic:cNvPr id="1729563290" name=""/>
+                    <pic:cNvPicPr/>
+                  </pic:nvPicPr>
+                  <pic:blipFill>
+                    <a:blip r:embed="rId25"/>
+                    <a:stretch>
+                      <a:fillRect/>
+                    </a:stretch>
+                  </pic:blipFill>
+                  <pic:spPr>
+                    <a:xfrm>
+                      <a:off x="0" y="0"/>
+                      <a:ext cx="5943600" cy="3611245"/>
+                    </a:xfrm>
+                    <a:prstGeom prst="rect">
+                      <a:avLst/>
+                    </a:prstGeom>
+                  </pic:spPr>
+                </pic:pic>
+              </a:graphicData>
+            </a:graphic>
+          </wp:inline>
+        </w:drawing>
+      </w:r>
+      <w:r>
+        <w:rPr>
+          <w:rFonts w:ascii="Times New Roman" w:hAnsi="Times New Roman" w:cs="Times New Roman"/>
+          <w:sz w:val="20"/>
+          <w:szCs w:val="20"/>
+        </w:rPr>
+        <w:lastRenderedPageBreak/>
+        <w:drawing>
+          <wp:inline distT="0" distB="0" distL="0" distR="0" wp14:anchorId="73AD44F6" wp14:editId="5AE80FA4">
+            <wp:extent cx="5943600" cy="3620770"/>
+            <wp:effectExtent l="0" t="0" r="0" b="0"/>
+            <wp:docPr id="1457343275" name="Picture 1"/>
+            <wp:cNvGraphicFramePr>
+              <a:graphicFrameLocks xmlns:a="http://schemas.openxmlformats.org/drawingml/2006/main" noChangeAspect="1"/>
+            </wp:cNvGraphicFramePr>
+            <a:graphic xmlns:a="http://schemas.openxmlformats.org/drawingml/2006/main">
+              <a:graphicData uri="http://schemas.openxmlformats.org/drawingml/2006/picture">
+                <pic:pic xmlns:pic="http://schemas.openxmlformats.org/drawingml/2006/picture">
+                  <pic:nvPicPr>
+                    <pic:cNvPr id="1457343275" name=""/>
+                    <pic:cNvPicPr/>
+                  </pic:nvPicPr>
+                  <pic:blipFill>
+                    <a:blip r:embed="rId26"/>
+                    <a:stretch>
+                      <a:fillRect/>
+                    </a:stretch>
+                  </pic:blipFill>
+                  <pic:spPr>
+                    <a:xfrm>
+                      <a:off x="0" y="0"/>
+                      <a:ext cx="5943600" cy="3620770"/>
+                    </a:xfrm>
+                    <a:prstGeom prst="rect">
+                      <a:avLst/>
+                    </a:prstGeom>
+                  </pic:spPr>
+                </pic:pic>
+              </a:graphicData>
+            </a:graphic>
+          </wp:inline>
+        </w:drawing>
+      </w:r>
+    </w:p>
+    <w:p>
+      <w:pPr>
+        <w:rPr>
+          <w:rFonts w:ascii="Times New Roman" w:hAnsi="Times New Roman" w:cs="Times New Roman"/>
+          <w:sz w:val="20"/>
+          <w:szCs w:val="20"/>
+        </w:rPr>
+      </w:pPr>
+      <w:r>
+        <w:rPr>
+          <w:rFonts w:ascii="Times New Roman" w:hAnsi="Times New Roman" w:cs="Times New Roman"/>
+          <w:sz w:val="20"/>
+          <w:szCs w:val="20"/>
+        </w:rPr>
+        <w:t>succesful. now have to change it so it adds a type for really sharp structures and that anything that seems floating is just seen as canopy.</w:t>
+      </w:r>
+      <w:r>
+        <w:rPr>
+          <w:rFonts w:ascii="Times New Roman" w:hAnsi="Times New Roman" w:cs="Times New Roman"/>
+          <w:sz w:val="20"/>
+          <w:szCs w:val="20"/>
+        </w:rPr>
+        <w:t xml:space="preserve"> also the tubes should connect to eachother</w:t>
+      </w:r>
+    </w:p>
+    <w:p>
+      <w:pPr>
+        <w:rPr>
+          <w:rFonts w:ascii="Times New Roman" w:hAnsi="Times New Roman" w:cs="Times New Roman"/>
+          <w:sz w:val="20"/>
+          <w:szCs w:val="20"/>
+          <w:u w:val="single"/>
+        </w:rPr>
+      </w:pPr>
+      <w:r>
+        <w:rPr>
+          <w:rFonts w:ascii="Times New Roman" w:hAnsi="Times New Roman" w:cs="Times New Roman"/>
+          <w:sz w:val="20"/>
+          <w:szCs w:val="20"/>
+          <w:u w:val="single"/>
+        </w:rPr>
+        <w:t>also, to judge better what is what, by the angle it hits a point it should be able to calculate a map for accesibility (clearance map or whatever it would be called), which means that point cannot be connected to other points if the connection would happen in the clearance area of itself</w:t>
+      </w:r>
+    </w:p>
+    <w:p>
+      <w:pPr>
+        <w:rPr>
+          <w:rFonts w:ascii="Times New Roman" w:hAnsi="Times New Roman" w:cs="Times New Roman"/>
+          <w:sz w:val="20"/>
+          <w:szCs w:val="20"/>
+        </w:rPr>
+      </w:pPr>
+    </w:p>
+    <w:p>
+      <w:pPr>
+        <w:rPr>
+          <w:rFonts w:ascii="Times New Roman" w:hAnsi="Times New Roman" w:cs="Times New Roman"/>
+          <w:sz w:val="20"/>
+          <w:szCs w:val="20"/>
+        </w:rPr>
+      </w:pPr>
+      <w:r>
+        <w:rPr>
+          <w:rFonts w:ascii="Times New Roman" w:hAnsi="Times New Roman" w:cs="Times New Roman"/>
+          <w:sz w:val="20"/>
+          <w:szCs w:val="20"/>
+        </w:rPr>
+        <w:drawing>
+          <wp:inline distT="0" distB="0" distL="0" distR="0" wp14:anchorId="4D0886EA" wp14:editId="40E69F33">
+            <wp:extent cx="5943600" cy="2861310"/>
+            <wp:effectExtent l="0" t="0" r="0" b="0"/>
+            <wp:docPr id="1825681086" name="Picture 1"/>
+            <wp:cNvGraphicFramePr>
+              <a:graphicFrameLocks xmlns:a="http://schemas.openxmlformats.org/drawingml/2006/main" noChangeAspect="1"/>
+            </wp:cNvGraphicFramePr>
+            <a:graphic xmlns:a="http://schemas.openxmlformats.org/drawingml/2006/main">
+              <a:graphicData uri="http://schemas.openxmlformats.org/drawingml/2006/picture">
+                <pic:pic xmlns:pic="http://schemas.openxmlformats.org/drawingml/2006/picture">
+                  <pic:nvPicPr>
+                    <pic:cNvPr id="1825681086" name=""/>
+                    <pic:cNvPicPr/>
+                  </pic:nvPicPr>
+                  <pic:blipFill>
+                    <a:blip r:embed="rId27"/>
+                    <a:stretch>
+                      <a:fillRect/>
+                    </a:stretch>
+                  </pic:blipFill>
+                  <pic:spPr>
+                    <a:xfrm>
+                      <a:off x="0" y="0"/>
+                      <a:ext cx="5943600" cy="2861310"/>
+                    </a:xfrm>
+                    <a:prstGeom prst="rect">
+                      <a:avLst/>
+                    </a:prstGeom>
+                  </pic:spPr>
+                </pic:pic>
+              </a:graphicData>
+            </a:graphic>
+          </wp:inline>
+        </w:drawing>
+      </w:r>
+    </w:p>
+    <w:p>
+      <w:pPr>
+        <w:rPr>
+          <w:rFonts w:ascii="Times New Roman" w:hAnsi="Times New Roman" w:cs="Times New Roman"/>
+          <w:sz w:val="20"/>
+          <w:szCs w:val="20"/>
+        </w:rPr>
+      </w:pPr>
+      <w:r>
+        <w:rPr>
+          <w:rFonts w:ascii="Times New Roman" w:hAnsi="Times New Roman" w:cs="Times New Roman"/>
+          <w:sz w:val="20"/>
+          <w:szCs w:val="20"/>
+        </w:rPr>
+        <w:t xml:space="preserve">finally got the box to be constructed nicely, altho the terrain looks like bulgarian </w:t>
+      </w:r>
+      <w:r>
+        <w:rPr>
+          <w:rFonts w:ascii="Times New Roman" w:hAnsi="Times New Roman" w:cs="Times New Roman"/>
+          <w:sz w:val="20"/>
+          <w:szCs w:val="20"/>
+        </w:rPr>
+        <w:t>highways</w:t>
+      </w:r>
+    </w:p>
+    <w:p>
+      <w:pPr>
+        <w:rPr>
+          <w:rFonts w:ascii="Times New Roman" w:hAnsi="Times New Roman" w:cs="Times New Roman"/>
+          <w:sz w:val="20"/>
+          <w:szCs w:val="20"/>
+        </w:rPr>
+      </w:pPr>
+      <w:r>
+        <w:rPr>
+          <w:rFonts w:ascii="Times New Roman" w:hAnsi="Times New Roman" w:cs="Times New Roman"/>
+          <w:sz w:val="20"/>
+          <w:szCs w:val="20"/>
+        </w:rPr>
+        <w:lastRenderedPageBreak/>
+        <w:drawing>
+          <wp:inline distT="0" distB="0" distL="0" distR="0" wp14:anchorId="36D48EB8" wp14:editId="2126BAB8">
+            <wp:extent cx="5943600" cy="3620770"/>
+            <wp:effectExtent l="0" t="0" r="0" b="0"/>
+            <wp:docPr id="4802985" name="Picture 1"/>
+            <wp:cNvGraphicFramePr>
+              <a:graphicFrameLocks xmlns:a="http://schemas.openxmlformats.org/drawingml/2006/main" noChangeAspect="1"/>
+            </wp:cNvGraphicFramePr>
+            <a:graphic xmlns:a="http://schemas.openxmlformats.org/drawingml/2006/main">
+              <a:graphicData uri="http://schemas.openxmlformats.org/drawingml/2006/picture">
+                <pic:pic xmlns:pic="http://schemas.openxmlformats.org/drawingml/2006/picture">
+                  <pic:nvPicPr>
+                    <pic:cNvPr id="4802985" name=""/>
+                    <pic:cNvPicPr/>
+                  </pic:nvPicPr>
+                  <pic:blipFill>
+                    <a:blip r:embed="rId28"/>
+                    <a:stretch>
+                      <a:fillRect/>
+                    </a:stretch>
+                  </pic:blipFill>
+                  <pic:spPr>
+                    <a:xfrm>
+                      <a:off x="0" y="0"/>
+                      <a:ext cx="5943600" cy="3620770"/>
+                    </a:xfrm>
+                    <a:prstGeom prst="rect">
+                      <a:avLst/>
+                    </a:prstGeom>
+                  </pic:spPr>
+                </pic:pic>
+              </a:graphicData>
+            </a:graphic>
+          </wp:inline>
+        </w:drawing>
+      </w:r>
+    </w:p>
+    <w:p>
+      <w:pPr>
+        <w:rPr>
+          <w:rFonts w:ascii="Times New Roman" w:hAnsi="Times New Roman" w:cs="Times New Roman"/>
+          <w:sz w:val="20"/>
+          <w:szCs w:val="20"/>
+        </w:rPr>
+      </w:pPr>
+      <w:r>
+        <w:rPr>
+          <w:rFonts w:ascii="Times New Roman" w:hAnsi="Times New Roman" w:cs="Times New Roman"/>
+          <w:sz w:val="20"/>
+          <w:szCs w:val="20"/>
+        </w:rPr>
+        <w:t>GOOD.</w:t>
+      </w:r>
+    </w:p>
+    <w:p>
+      <w:pPr>
+        <w:rPr>
+          <w:rFonts w:ascii="Times New Roman" w:hAnsi="Times New Roman" w:cs="Times New Roman"/>
+          <w:sz w:val="20"/>
+          <w:szCs w:val="20"/>
+        </w:rPr>
+      </w:pPr>
+      <w:r>
+        <w:rPr>
+          <w:rFonts w:ascii="Times New Roman" w:hAnsi="Times New Roman" w:cs="Times New Roman"/>
+          <w:sz w:val="20"/>
+          <w:szCs w:val="20"/>
+        </w:rPr>
+        <w:drawing>
+          <wp:inline distT="0" distB="0" distL="0" distR="0" wp14:anchorId="6DCFE4F0" wp14:editId="323F98B7">
+            <wp:extent cx="5943600" cy="3620770"/>
+            <wp:effectExtent l="0" t="0" r="0" b="0"/>
+            <wp:docPr id="461225548" name="Picture 1"/>
+            <wp:cNvGraphicFramePr>
+              <a:graphicFrameLocks xmlns:a="http://schemas.openxmlformats.org/drawingml/2006/main" noChangeAspect="1"/>
+            </wp:cNvGraphicFramePr>
+            <a:graphic xmlns:a="http://schemas.openxmlformats.org/drawingml/2006/main">
+              <a:graphicData uri="http://schemas.openxmlformats.org/drawingml/2006/picture">
+                <pic:pic xmlns:pic="http://schemas.openxmlformats.org/drawingml/2006/picture">
+                  <pic:nvPicPr>
+                    <pic:cNvPr id="461225548" name=""/>
+                    <pic:cNvPicPr/>
+                  </pic:nvPicPr>
+                  <pic:blipFill>
+                    <a:blip r:embed="rId29"/>
+                    <a:stretch>
+                      <a:fillRect/>
+                    </a:stretch>
+                  </pic:blipFill>
+                  <pic:spPr>
+                    <a:xfrm>
+                      <a:off x="0" y="0"/>
+                      <a:ext cx="5943600" cy="3620770"/>
+                    </a:xfrm>
+                    <a:prstGeom prst="rect">
+                      <a:avLst/>
+                    </a:prstGeom>
+                  </pic:spPr>
+                </pic:pic>
+              </a:graphicData>
+            </a:graphic>
+          </wp:inline>
+        </w:drawing>
+      </w:r>
+    </w:p>
+    <w:p>
+      <w:pPr>
+        <w:rPr>
+          <w:rFonts w:ascii="Times New Roman" w:hAnsi="Times New Roman" w:cs="Times New Roman"/>
+          <w:sz w:val="20"/>
+          <w:szCs w:val="20"/>
+        </w:rPr>
+      </w:pPr>
+      <w:r>
+        <w:rPr>
+          <w:rFonts w:ascii="Times New Roman" w:hAnsi="Times New Roman" w:cs="Times New Roman"/>
+          <w:sz w:val="20"/>
+          <w:szCs w:val="20"/>
+        </w:rPr>
+        <w:t>EVEN BETTER</w:t>
+      </w:r>
+    </w:p>
+    <w:p>
+      <w:pPr>
+        <w:rPr>
+          <w:rFonts w:ascii="Times New Roman" w:hAnsi="Times New Roman" w:cs="Times New Roman"/>
+          <w:sz w:val="20"/>
+          <w:szCs w:val="20"/>
+        </w:rPr>
+      </w:pPr>
+      <w:r>
+        <w:rPr>
+          <w:rFonts w:ascii="Times New Roman" w:hAnsi="Times New Roman" w:cs="Times New Roman"/>
+          <w:sz w:val="20"/>
+          <w:szCs w:val="20"/>
+        </w:rPr>
+        <w:t>now faces are rendered from both sides. have to make it connect triangles better</w:t>
+      </w:r>
     </w:p>
     <w:sectPr>
       <w:pgSz w:w="12240" w:h="15840"/>
@@ -3203,7 +4085,6 @@
   <w:style w:type="character" w:default="1" w:styleId="DefaultParagraphFont">
     <w:name w:val="Default Paragraph Font"/>
     <w:uiPriority w:val="1"/>
-    <w:semiHidden/>
     <w:unhideWhenUsed/>
   </w:style>
   <w:style w:type="table" w:default="1" w:styleId="TableNormal">

</xml_diff>